<commit_message>
Procuração de José Camelo Vieira em modelo geral, em uma página
Co-Authored-By: Claude Opus 5.5 <noreply@anthropic.com>
Claude-Session: https://claude.ai/code/session_01Xsu4pqME44bHWZ5AQA6nY7
</commit_message>
<xml_diff>
--- a/José Camelo Vieira - Ação bancária/Procuração - José Camelo Vieira.docx
+++ b/José Camelo Vieira - Ação bancária/Procuração - José Camelo Vieira.docx
@@ -95,90 +95,7 @@
         <w:t xml:space="preserve">PODERES:</w:t>
       </w:r>
       <w:r>
-        <w:t xml:space="preserve"> Pelo presente instrumento, o OUTORGANTE nomeia e constitui seu bastante procurador o OUTORGADO, a quem confere amplos poderes para o foro em geral, com a cláusula ad judicia et extra, nos termos do art. 105 do Código de Processo Civil e do art. 5º, § 2º, da Lei nº 8.906/1994, para representá-lo perante qualquer juízo, instância ou tribunal, inclusive Juizados Especiais, podendo propor as ações competentes e defendê-lo nas contrárias, seguindo umas e outras até final decisão, interpor recursos e promover o cumprimento de sentença.</w:t>
-      </w:r>
-    </w:p>
-    <w:p>
-      <w:pPr>
-        <w:spacing w:after="0"/>
-      </w:pPr>
-    </w:p>
-    <w:p>
-      <w:pPr>
-        <w:spacing w:line="360"/>
-        <w:jc w:val="both"/>
-      </w:pPr>
-      <w:r>
-        <w:rPr>
-          <w:b/>
-          <w:bCs/>
-        </w:rPr>
-        <w:t xml:space="preserve">PODERES ESPECIAIS:</w:t>
-      </w:r>
-      <w:r>
-        <w:t xml:space="preserve"> Confere, ainda, poderes especiais para receber citação, confessar, reconhecer a procedência do pedido, transigir, desistir, renunciar ao direito sobre o qual se funda a ação, receber e dar quitação, firmar compromisso, assinar declaração de hipossuficiência econômica para fins de gratuidade da justiça, requerer e levantar alvarás judiciais e valores depositados em nome do OUTORGANTE, bem como substabelecer, com ou sem reserva de poderes.</w:t>
-      </w:r>
-    </w:p>
-    <w:p>
-      <w:pPr>
-        <w:spacing w:after="0"/>
-      </w:pPr>
-    </w:p>
-    <w:p>
-      <w:pPr>
-        <w:spacing w:line="360"/>
-        <w:jc w:val="both"/>
-      </w:pPr>
-      <w:r>
-        <w:rPr>
-          <w:b/>
-          <w:bCs/>
-        </w:rPr>
-        <w:t xml:space="preserve">FINALIDADE ESPECÍFICA:</w:t>
-      </w:r>
-      <w:r>
-        <w:t xml:space="preserve"> Propor e acompanhar ações judiciais em face do </w:t>
-      </w:r>
-      <w:r>
-        <w:rPr>
-          <w:b/>
-          <w:bCs/>
-        </w:rPr>
-        <w:t xml:space="preserve">BANCO DO BRASIL S.A.</w:t>
-      </w:r>
-      <w:r>
-        <w:t xml:space="preserve">, do </w:t>
-      </w:r>
-      <w:r>
-        <w:rPr>
-          <w:b/>
-          <w:bCs/>
-        </w:rPr>
-        <w:t xml:space="preserve">BANCO BRADESCO S.A.</w:t>
-      </w:r>
-      <w:r>
-        <w:t xml:space="preserve"> e/ou de quaisquer outras instituições financeiras, relativas a contratos de empréstimo consignado, crédito pessoal (inclusive “BB Crédito Benefício”), renovações, refinanciamentos e portabilidades, cartão de crédito com reserva de margem consignável (RMC/RCC), seguros, tarifas e quaisquer descontos incidentes sobre o benefício previdenciário nº 194.694.808-7 ou sobre a conta corrente nº 24.809-6, agência 2298-5, do Banco do Brasil, notadamente ações declaratórias de inexistência ou nulidade de débito, revisionais, de repetição de indébito e de indenização por danos materiais e morais.</w:t>
-      </w:r>
-    </w:p>
-    <w:p>
-      <w:pPr>
-        <w:spacing w:after="0"/>
-      </w:pPr>
-    </w:p>
-    <w:p>
-      <w:pPr>
-        <w:spacing w:line="360"/>
-        <w:jc w:val="both"/>
-      </w:pPr>
-      <w:r>
-        <w:rPr>
-          <w:b/>
-          <w:bCs/>
-        </w:rPr>
-        <w:t xml:space="preserve">PODERES EXTRAJUDICIAIS:</w:t>
-      </w:r>
-      <w:r>
-        <w:t xml:space="preserve"> Representar o OUTORGANTE perante as referidas instituições financeiras, o Instituto Nacional do Seguro Social (INSS), o Banco Central do Brasil, o PROCON, a plataforma consumidor.gov.br e demais órgãos públicos ou privados, podendo requerer cópias de contratos, extratos, faturas, históricos de empréstimos, gravações e protocolos de atendimento, formular reclamações e requerimentos administrativos, solicitar bloqueio ou desbloqueio do benefício para operações de crédito, notificar, receber e dar quitação, praticando, enfim, todos os atos necessários ao fiel cumprimento deste mandato.</w:t>
+        <w:t xml:space="preserve"> Pelo presente instrumento, o OUTORGANTE nomeia e constitui seu bastante procurador o OUTORGADO, a quem confere amplos poderes para o foro em geral, com a cláusula ad judicia et extra, nos termos do art. 105 do Código de Processo Civil e do art. 5º, § 2º, da Lei nº 8.906/1994, para representá-lo perante qualquer juízo, instância ou tribunal, bem como perante repartições públicas, autarquias, instituições financeiras e entidades privadas, podendo propor as ações competentes e defendê-lo nas contrárias, seguindo umas e outras até final decisão, interpor recursos e promover o cumprimento de sentença; conferindo-lhe, ainda, poderes especiais para receber citação, confessar, reconhecer a procedência do pedido, transigir, desistir, renunciar ao direito sobre o qual se funda a ação, receber e dar quitação, firmar compromisso, assinar declaração de hipossuficiência econômica, requerer e levantar alvarás judiciais, requerer documentos, contratos e extratos, e substabelecer, com ou sem reserva de poderes, praticando, enfim, todos os atos necessários ao fiel cumprimento deste mandato.</w:t>
       </w:r>
     </w:p>
     <w:p>

</xml_diff>